<commit_message>
push me please mwuah
</commit_message>
<xml_diff>
--- a/resources/templates/MOA_MASTER_TEMPLATE.docx
+++ b/resources/templates/MOA_MASTER_TEMPLATE.docx
@@ -1223,73 +1223,59 @@
           <w:spacing w:val="-3"/>
           <w:lang w:val="en-US"/>
         </w:rPr>
-        <w:t>S</w:t>
-      </w:r>
-      <w:bookmarkStart w:id="12" w:name="_GoBack"/>
-      <w:bookmarkEnd w:id="12"/>
-      <w:r>
-        <w:rPr>
-          <w:rFonts w:hint="default"/>
+        <w:t>S_</w:t>
+      </w:r>
+      <w:r>
+        <w:rPr>
           <w:b/>
           <w:bCs/>
           <w:spacing w:val="-3"/>
           <w:lang w:val="en-US"/>
         </w:rPr>
-        <w:t>_</w:t>
-      </w:r>
-      <w:r>
-        <w:rPr>
-          <w:b/>
-          <w:bCs/>
-          <w:spacing w:val="-3"/>
+        <w:t xml:space="preserve">YEAR}} </w:t>
+      </w:r>
+      <w:r>
+        <w:t>at</w:t>
+      </w:r>
+      <w:r>
+        <w:rPr>
+          <w:spacing w:val="-2"/>
+        </w:rPr>
+        <w:t xml:space="preserve"> </w:t>
+      </w:r>
+      <w:r>
+        <w:rPr>
+          <w:spacing w:val="-1"/>
+        </w:rPr>
+        <w:t>t</w:t>
+      </w:r>
+      <w:r>
+        <w:rPr>
+          <w:spacing w:val="2"/>
+        </w:rPr>
+        <w:t>h</w:t>
+      </w:r>
+      <w:r>
+        <w:t>e</w:t>
+      </w:r>
+      <w:r>
+        <w:rPr>
           <w:lang w:val="en-US"/>
         </w:rPr>
-        <w:t xml:space="preserve">YEAR}} </w:t>
-      </w:r>
-      <w:r>
-        <w:t>at</w:t>
-      </w:r>
-      <w:r>
-        <w:rPr>
-          <w:spacing w:val="-2"/>
-        </w:rPr>
-        <w:t xml:space="preserve"> </w:t>
-      </w:r>
-      <w:r>
-        <w:rPr>
-          <w:spacing w:val="-1"/>
-        </w:rPr>
-        <w:t>t</w:t>
-      </w:r>
-      <w:r>
-        <w:rPr>
-          <w:spacing w:val="2"/>
-        </w:rPr>
-        <w:t>h</w:t>
-      </w:r>
-      <w:r>
-        <w:t>e</w:t>
-      </w:r>
-      <w:r>
-        <w:rPr>
+        <w:t xml:space="preserve"> </w:t>
+      </w:r>
+      <w:r>
+        <w:rPr>
+          <w:rFonts w:hint="default"/>
           <w:lang w:val="en-US"/>
         </w:rPr>
-        <w:t xml:space="preserve"> Municipality of  {{</w:t>
-      </w:r>
-      <w:r>
-        <w:rPr>
-          <w:rFonts w:ascii="Times New Roman Bold" w:hAnsi="Times New Roman Bold" w:cs="Times New Roman Bold"/>
-          <w:b/>
-          <w:bCs/>
+        <w:t>{{LOCATION_FULL}}</w:t>
+      </w:r>
+      <w:r>
+        <w:rPr>
           <w:lang w:val="en-US"/>
         </w:rPr>
-        <w:t>CITY</w:t>
-      </w:r>
-      <w:r>
-        <w:rPr>
-          <w:lang w:val="en-US"/>
-        </w:rPr>
-        <w:t xml:space="preserve">}}  </w:t>
+        <w:t xml:space="preserve"> </w:t>
       </w:r>
       <w:r>
         <w:t>,</w:t>
@@ -1491,6 +1477,8 @@
           <w:szCs w:val="28"/>
         </w:rPr>
       </w:pPr>
+      <w:bookmarkStart w:id="12" w:name="_GoBack"/>
+      <w:bookmarkEnd w:id="12"/>
     </w:p>
     <w:p>
       <w:pPr>
@@ -58927,24 +58915,7 @@
           <w:bCs/>
           <w:lang w:val="en-US"/>
         </w:rPr>
-        <w:t xml:space="preserve">   </w:t>
-      </w:r>
-      <w:r>
-        <w:rPr>
-          <w:b/>
-          <w:bCs/>
-          <w:lang w:val="en-US"/>
-        </w:rPr>
-        <w:t xml:space="preserve">                                            </w:t>
-      </w:r>
-      <w:r>
-        <w:rPr>
-          <w:b/>
-          <w:bCs/>
-          <w:color w:val="FF0000"/>
-          <w:sz w:val="22"/>
-        </w:rPr>
-        <w:t xml:space="preserve"> </w:t>
+        <w:t xml:space="preserve">  </w:t>
       </w:r>
       <w:r>
         <w:rPr>

</xml_diff>

<commit_message>
fix proper naming of address
</commit_message>
<xml_diff>
--- a/resources/templates/MOA_MASTER_TEMPLATE.docx
+++ b/resources/templates/MOA_MASTER_TEMPLATE.docx
@@ -3586,8 +3586,6 @@
           <w:szCs w:val="28"/>
         </w:rPr>
       </w:pPr>
-      <w:bookmarkStart w:id="12" w:name="_GoBack"/>
-      <w:bookmarkEnd w:id="12"/>
     </w:p>
     <w:p>
       <w:pPr>
@@ -39408,14 +39406,8 @@
         </w:rPr>
         <w:t>{{I_NAME}}</w:t>
       </w:r>
-      <w:r>
-        <w:rPr>
-          <w:b/>
-          <w:bCs/>
-          <w:u w:val="single"/>
-        </w:rPr>
-        <w:t>.</w:t>
-      </w:r>
+      <w:bookmarkStart w:id="12" w:name="_GoBack"/>
+      <w:bookmarkEnd w:id="12"/>
       <w:r>
         <w:rPr>
           <w:color w:val="000000"/>

</xml_diff>